<commit_message>
Auto commit: 2026/06/08 周一 23:36:08.66
</commit_message>
<xml_diff>
--- a/任务管理器.docx
+++ b/任务管理器.docx
@@ -3,6 +3,11 @@
 <w:document xmlns:wpc="http://schemas.microsoft.com/office/word/2010/wordprocessingCanvas" xmlns:cx="http://schemas.microsoft.com/office/drawing/2014/chartex" xmlns:cx1="http://schemas.microsoft.com/office/drawing/2015/9/8/chartex" xmlns:cx2="http://schemas.microsoft.com/office/drawing/2015/10/21/chartex" xmlns:cx3="http://schemas.microsoft.com/office/drawing/2016/5/9/chartex" xmlns:cx4="http://schemas.microsoft.com/office/drawing/2016/5/10/chartex" xmlns:cx5="http://schemas.microsoft.com/office/drawing/2016/5/11/chartex" xmlns:cx6="http://schemas.microsoft.com/office/drawing/2016/5/12/chartex" xmlns:cx7="http://schemas.microsoft.com/office/drawing/2016/5/13/chartex" xmlns:cx8="http://schemas.microsoft.com/office/drawing/2016/5/14/chartex" xmlns:mc="http://schemas.openxmlformats.org/markup-compatibility/2006" xmlns:aink="http://schemas.microsoft.com/office/drawing/2016/ink" xmlns:am3d="http://schemas.microsoft.com/office/drawing/2017/model3d" xmlns:o="urn:schemas-microsoft-com:office:office" xmlns:oel="http://schemas.microsoft.com/office/2019/extlst" xmlns:r="http://schemas.openxmlformats.org/officeDocument/2006/relationships" xmlns:m="http://schemas.openxmlformats.org/officeDocument/2006/math" xmlns:v="urn:schemas-microsoft-com:vml" xmlns:wp14="http://schemas.microsoft.com/office/word/2010/wordprocessingDrawing" xmlns:wp="http://schemas.openxmlformats.org/drawingml/2006/wordprocessingDrawing" xmlns:w10="urn:schemas-microsoft-com:office:word" xmlns:w="http://schemas.openxmlformats.org/wordprocessingml/2006/main" xmlns:w14="http://schemas.microsoft.com/office/word/2010/wordml" xmlns:w15="http://schemas.microsoft.com/office/word/2012/wordml" xmlns:w16cex="http://schemas.microsoft.com/office/word/2018/wordml/cex" xmlns:w16cid="http://schemas.microsoft.com/office/word/2016/wordml/cid" xmlns:w16="http://schemas.microsoft.com/office/word/2018/wordml" xmlns:w16du="http://schemas.microsoft.com/office/word/2023/wordml/word16du" xmlns:w16sdtdh="http://schemas.microsoft.com/office/word/2020/wordml/sdtdatahash" xmlns:w16sdtfl="http://schemas.microsoft.com/office/word/2024/wordml/sdtformatlock" xmlns:w16se="http://schemas.microsoft.com/office/word/2015/wordml/symex" xmlns:wpg="http://schemas.microsoft.com/office/word/2010/wordprocessingGroup" xmlns:wpi="http://schemas.microsoft.com/office/word/2010/wordprocessingInk" xmlns:wne="http://schemas.microsoft.com/office/word/2006/wordml" xmlns:wps="http://schemas.microsoft.com/office/word/2010/wordprocessingShape" mc:Ignorable="w14 w15 w16se w16cid w16 w16cex w16sdtdh w16sdtfl w16du wp14">
   <w:body>
     <w:p>
+      <w:pPr>
+        <w:rPr>
+          <w:rFonts w:hint="eastAsia"/>
+        </w:rPr>
+      </w:pPr>
       <w:r>
         <w:t>最终能实现的六大王牌功能</w:t>
       </w:r>
@@ -13,12 +18,20 @@
           <w:ilvl w:val="0"/>
           <w:numId w:val="1"/>
         </w:numPr>
+        <w:rPr>
+          <w:rFonts w:hint="eastAsia"/>
+        </w:rPr>
       </w:pPr>
       <w:r>
         <w:t>像素级“时空穿梭”卡顿确诊 实现场景：你在打游戏团战、写代码编译、或者窗口化切屏打牌时，突然感觉画面发生了一次恶心的轻微顿卡。</w:t>
       </w:r>
     </w:p>
     <w:p>
+      <w:pPr>
+        <w:rPr>
+          <w:rFonts w:hint="eastAsia"/>
+        </w:rPr>
+      </w:pPr>
       <w:r>
         <w:t>如何破案：事后来到大盘，不需要当时切屏。直接框选卡顿发生的那 2 秒钟。大盘依靠 PRIMARY KEY (timestamp)</w:t>
       </w:r>
@@ -53,12 +66,20 @@
           <w:ilvl w:val="0"/>
           <w:numId w:val="2"/>
         </w:numPr>
+        <w:rPr>
+          <w:rFonts w:hint="eastAsia"/>
+        </w:rPr>
       </w:pPr>
       <w:r>
         <w:t>后台“篡位者”与“隐藏李鬼”深度清算 实现场景：后台有未知程序在偷偷作恶，或者流氓软件伪装成核心组件。</w:t>
       </w:r>
     </w:p>
     <w:p>
+      <w:pPr>
+        <w:rPr>
+          <w:rFonts w:hint="eastAsia"/>
+        </w:rPr>
+      </w:pPr>
       <w:r>
         <w:t xml:space="preserve">如何破案：在大盘中通过 </w:t>
       </w:r>
@@ -81,6 +102,11 @@
       </w:r>
     </w:p>
     <w:p>
+      <w:pPr>
+        <w:rPr>
+          <w:rFonts w:hint="eastAsia"/>
+        </w:rPr>
+      </w:pPr>
       <w:r>
         <w:t xml:space="preserve">动机清算：通过 </w:t>
       </w:r>
@@ -94,6 +120,11 @@
       </w:r>
     </w:p>
     <w:p>
+      <w:pPr>
+        <w:rPr>
+          <w:rFonts w:hint="eastAsia"/>
+        </w:rPr>
+      </w:pPr>
       <w:r>
         <w:t xml:space="preserve">特权审计：通过 </w:t>
       </w:r>
@@ -107,6 +138,11 @@
       </w:r>
     </w:p>
     <w:p>
+      <w:pPr>
+        <w:rPr>
+          <w:rFonts w:hint="eastAsia"/>
+        </w:rPr>
+      </w:pPr>
       <w:r>
         <w:t xml:space="preserve">真伪识破：通过 </w:t>
       </w:r>
@@ -125,6 +161,9 @@
           <w:ilvl w:val="0"/>
           <w:numId w:val="3"/>
         </w:numPr>
+        <w:rPr>
+          <w:rFonts w:hint="eastAsia"/>
+        </w:rPr>
       </w:pPr>
       <w:r>
         <w:t>svchost.exe 寄生内鬼终极剥离 实现场景：Windows 任务管理器里最让人头疼的是，经常看到 svchost.exe 吃满了 CPU</w:t>
@@ -135,6 +174,11 @@
       </w:r>
     </w:p>
     <w:p>
+      <w:pPr>
+        <w:rPr>
+          <w:rFonts w:hint="eastAsia"/>
+        </w:rPr>
+      </w:pPr>
       <w:r>
         <w:t xml:space="preserve">如何破案：探针在内存层深度解耦。当映像名为 svchost.exe 时，数据库通过 </w:t>
       </w:r>
@@ -164,12 +208,20 @@
           <w:ilvl w:val="0"/>
           <w:numId w:val="4"/>
         </w:numPr>
+        <w:rPr>
+          <w:rFonts w:hint="eastAsia"/>
+        </w:rPr>
       </w:pPr>
       <w:r>
         <w:t>窗口形态与拉伸重绘冲突审计 实现场景：很多卡牌游戏或挂机工具在窗口化运行、高频切屏、或者无边框拉伸窗口时，往往会引发诡异的 DPC 延迟排队。</w:t>
       </w:r>
     </w:p>
     <w:p>
+      <w:pPr>
+        <w:rPr>
+          <w:rFonts w:hint="eastAsia"/>
+        </w:rPr>
+      </w:pPr>
       <w:r>
         <w:t xml:space="preserve">如何破案：大盘通过联动 </w:t>
       </w:r>
@@ -208,18 +260,31 @@
           <w:ilvl w:val="0"/>
           <w:numId w:val="5"/>
         </w:numPr>
+        <w:rPr>
+          <w:rFonts w:hint="eastAsia"/>
+        </w:rPr>
       </w:pPr>
       <w:r>
         <w:t>9950X3D 跨 CCD 调度瘫痪与 5080 撞墙尸检 实现场景：顶级硬件没有跑满满血性能，出现莫名其妙的帧率抖动。</w:t>
       </w:r>
     </w:p>
     <w:p>
+      <w:pPr>
+        <w:rPr>
+          <w:rFonts w:hint="eastAsia"/>
+        </w:rPr>
+      </w:pPr>
       <w:r>
         <w:lastRenderedPageBreak/>
         <w:t>如何破案：</w:t>
       </w:r>
     </w:p>
     <w:p>
+      <w:pPr>
+        <w:rPr>
+          <w:rFonts w:hint="eastAsia"/>
+        </w:rPr>
+      </w:pPr>
       <w:r>
         <w:t xml:space="preserve">CPU 侧：通过 </w:t>
       </w:r>
@@ -237,6 +302,11 @@
       </w:r>
     </w:p>
     <w:p>
+      <w:pPr>
+        <w:rPr>
+          <w:rFonts w:hint="eastAsia"/>
+        </w:rPr>
+      </w:pPr>
       <w:r>
         <w:t xml:space="preserve">GPU 侧：通过 </w:t>
       </w:r>
@@ -259,6 +329,9 @@
           <w:ilvl w:val="0"/>
           <w:numId w:val="6"/>
         </w:numPr>
+        <w:rPr>
+          <w:rFonts w:hint="eastAsia"/>
+        </w:rPr>
       </w:pPr>
       <w:r>
         <w:t>进程无故闪退“死因溯源（尸检）” 实现场景：写代码跑脚本或大型游戏在毫无征兆的情况下突然“咔哒”一声闪退，桌面上什么都没留下，Windows</w:t>
@@ -269,6 +342,11 @@
       </w:r>
     </w:p>
     <w:p>
+      <w:pPr>
+        <w:rPr>
+          <w:rFonts w:hint="eastAsia"/>
+        </w:rPr>
+      </w:pPr>
       <w:r>
         <w:t xml:space="preserve">如何破案：事实表通过 </w:t>
       </w:r>
@@ -310,6 +388,11 @@
       </w:r>
     </w:p>
     <w:p>
+      <w:pPr>
+        <w:rPr>
+          <w:rFonts w:hint="eastAsia"/>
+        </w:rPr>
+      </w:pPr>
       <w:r>
         <w:t>如何实现“任何时候”： 在月度分区和覆盖索引的加持下，数据库里形成了一条完美的、没有断层的“全维硬件时空长河”。你可以随时把 Grafana</w:t>
       </w:r>
@@ -323,6 +406,11 @@
       </w:r>
     </w:p>
     <w:p>
+      <w:pPr>
+        <w:rPr>
+          <w:rFonts w:hint="eastAsia"/>
+        </w:rPr>
+      </w:pPr>
       <w:r>
         <w:t>如何实现“随时随地”： 因为我们的核心数仓（PostgreSQL）和展示前端（Grafana）全部关在 Docker 容器里，这意味着它的前端是一个标准的</w:t>
       </w:r>
@@ -351,6 +439,11 @@
       </w:r>
     </w:p>
     <w:p>
+      <w:pPr>
+        <w:rPr>
+          <w:rFonts w:hint="eastAsia"/>
+        </w:rPr>
+      </w:pPr>
       <w:r>
         <w:rPr>
           <w:rFonts w:ascii="Segoe UI Emoji" w:hAnsi="Segoe UI Emoji" w:cs="Segoe UI Emoji"/>
@@ -367,6 +460,9 @@
           <w:ilvl w:val="0"/>
           <w:numId w:val="7"/>
         </w:numPr>
+        <w:rPr>
+          <w:rFonts w:hint="eastAsia"/>
+        </w:rPr>
       </w:pPr>
       <w:r>
         <w:t>个人生产力与“数字生活”工时无感审计 功能描述：普通的工时软件需要你手动打卡，而我们的系统通过舱室 2（</w:t>
@@ -412,6 +508,11 @@
       </w:r>
     </w:p>
     <w:p>
+      <w:pPr>
+        <w:rPr>
+          <w:rFonts w:hint="eastAsia"/>
+        </w:rPr>
+      </w:pPr>
       <w:r>
         <w:t>回看效果：你可以随时拉出一个月的大账单，Grafana 会用极其通透的饼图和甘特图告诉你：这一个月下来，你到底有多少个小时聚焦在</w:t>
       </w:r>
@@ -430,12 +531,20 @@
           <w:ilvl w:val="0"/>
           <w:numId w:val="8"/>
         </w:numPr>
+        <w:rPr>
+          <w:rFonts w:hint="eastAsia"/>
+        </w:rPr>
       </w:pPr>
       <w:r>
         <w:t>硬件长期“体质老化”与散热缩缸趋势追踪 功能描述：这是 9950X3D + 5080 顶配硬件最需要的长期健康体检功能。</w:t>
       </w:r>
     </w:p>
     <w:p>
+      <w:pPr>
+        <w:rPr>
+          <w:rFonts w:hint="eastAsia"/>
+        </w:rPr>
+      </w:pPr>
       <w:r>
         <w:t xml:space="preserve">回看效果：因为我们记录了全局的 </w:t>
       </w:r>
@@ -481,6 +590,9 @@
           <w:ilvl w:val="0"/>
           <w:numId w:val="9"/>
         </w:numPr>
+        <w:rPr>
+          <w:rFonts w:hint="eastAsia"/>
+        </w:rPr>
       </w:pPr>
       <w:r>
         <w:t>离线/挂机/ overnight 任务“真实现场全景复盘” 功能描述：当你把电脑丢在那去睡觉、或者出门，让它通宵跑本地 AI</w:t>
@@ -491,6 +603,11 @@
       </w:r>
     </w:p>
     <w:p>
+      <w:pPr>
+        <w:rPr>
+          <w:rFonts w:hint="eastAsia"/>
+        </w:rPr>
+      </w:pPr>
       <w:r>
         <w:t>回看效果：你躺在床上，掏出手机打开 Grafana，就能实时看到家里的怪兽机跑得有多猛。第二天早上起来，你可以直接看昨晚的历史曲线：任务在凌晨 3</w:t>
       </w:r>
@@ -517,6 +634,9 @@
           <w:ilvl w:val="0"/>
           <w:numId w:val="10"/>
         </w:numPr>
+        <w:rPr>
+          <w:rFonts w:hint="eastAsia"/>
+        </w:rPr>
       </w:pPr>
       <w:r>
         <w:t xml:space="preserve">算力电费与能源消耗大账单 功能描述：全量锁死了 </w:t>
@@ -539,6 +659,11 @@
       </w:r>
     </w:p>
     <w:p>
+      <w:pPr>
+        <w:rPr>
+          <w:rFonts w:hint="eastAsia"/>
+        </w:rPr>
+      </w:pPr>
       <w:r>
         <w:t>回看效果：大盘可以通过简单的积分公式 SUM(功耗 *</w:t>
       </w:r>
@@ -557,6 +682,11 @@
       </w:r>
     </w:p>
     <w:p>
+      <w:pPr>
+        <w:rPr>
+          <w:rFonts w:hint="eastAsia"/>
+        </w:rPr>
+      </w:pPr>
       <w:r>
         <w:rPr>
           <w:rFonts w:ascii="Segoe UI Emoji" w:hAnsi="Segoe UI Emoji" w:cs="Segoe UI Emoji"/>
@@ -568,6 +698,11 @@
       </w:r>
     </w:p>
     <w:p>
+      <w:pPr>
+        <w:rPr>
+          <w:rFonts w:hint="eastAsia"/>
+        </w:rPr>
+      </w:pPr>
       <w:r>
         <w:t>顶层看板（宏观常态）：用最通透的数字大字报，常态化显示系统今天的累计开销、当</w:t>
       </w:r>
@@ -577,11 +712,21 @@
       </w:r>
     </w:p>
     <w:p>
+      <w:pPr>
+        <w:rPr>
+          <w:rFonts w:hint="eastAsia"/>
+        </w:rPr>
+      </w:pPr>
       <w:r>
         <w:t>中层时间轴（时空复盘）：一根雷打不动的横向时间轴。无论你把时间拖到哪一天，下方的折线图都会平滑地拉出那一天的温度、功耗和网络心电图。</w:t>
       </w:r>
     </w:p>
     <w:p>
+      <w:pPr>
+        <w:rPr>
+          <w:rFonts w:hint="eastAsia"/>
+        </w:rPr>
+      </w:pPr>
       <w:r>
         <w:t>底层进程明细（微观动机）：你在时间轴上框选任意一个常态区间，下方会自动联动，清晰地按使用时长和开销降降序排列出那段时间你运行过的所有前后台程序。</w:t>
       </w:r>
@@ -731,6 +876,11 @@
       </w:r>
     </w:p>
     <w:p>
+      <w:pPr>
+        <w:rPr>
+          <w:rFonts w:hint="eastAsia"/>
+        </w:rPr>
+      </w:pPr>
       <w:r>
         <w:t xml:space="preserve">alter table </w:t>
       </w:r>
@@ -753,6 +903,11 @@
       </w:r>
     </w:p>
     <w:p>
+      <w:pPr>
+        <w:rPr>
+          <w:rFonts w:hint="eastAsia"/>
+        </w:rPr>
+      </w:pPr>
       <w:r>
         <w:t xml:space="preserve">create unique index </w:t>
       </w:r>
@@ -1099,6 +1254,11 @@
       </w:r>
     </w:p>
     <w:p>
+      <w:pPr>
+        <w:rPr>
+          <w:rFonts w:hint="eastAsia"/>
+        </w:rPr>
+      </w:pPr>
       <w:r>
         <w:t xml:space="preserve">alter table </w:t>
       </w:r>
@@ -1121,6 +1281,11 @@
       </w:r>
     </w:p>
     <w:p>
+      <w:pPr>
+        <w:rPr>
+          <w:rFonts w:hint="eastAsia"/>
+        </w:rPr>
+      </w:pPr>
       <w:r>
         <w:t xml:space="preserve">create index </w:t>
       </w:r>
@@ -1175,6 +1340,11 @@
       </w:r>
     </w:p>
     <w:p>
+      <w:pPr>
+        <w:rPr>
+          <w:rFonts w:hint="eastAsia"/>
+        </w:rPr>
+      </w:pPr>
       <w:r>
         <w:t>create table fact_process_activity_y2026w23</w:t>
       </w:r>
@@ -1193,6 +1363,11 @@
       </w:r>
     </w:p>
     <w:p>
+      <w:pPr>
+        <w:rPr>
+          <w:rFonts w:hint="eastAsia"/>
+        </w:rPr>
+      </w:pPr>
       <w:r>
         <w:t>alter table fact_process_activity_y2026w23</w:t>
       </w:r>
@@ -1210,6 +1385,11 @@
       </w:r>
     </w:p>
     <w:p>
+      <w:pPr>
+        <w:rPr>
+          <w:rFonts w:hint="eastAsia"/>
+        </w:rPr>
+      </w:pPr>
       <w:r>
         <w:t>create table fact_process_activity_y2026w24</w:t>
       </w:r>
@@ -1228,6 +1408,11 @@
       </w:r>
     </w:p>
     <w:p>
+      <w:pPr>
+        <w:rPr>
+          <w:rFonts w:hint="eastAsia"/>
+        </w:rPr>
+      </w:pPr>
       <w:r>
         <w:t>alter table fact_process_activity_y2026w24</w:t>
       </w:r>
@@ -1245,6 +1430,11 @@
       </w:r>
     </w:p>
     <w:p>
+      <w:pPr>
+        <w:rPr>
+          <w:rFonts w:hint="eastAsia"/>
+        </w:rPr>
+      </w:pPr>
       <w:r>
         <w:t>create table fact_process_activity_y2026w25</w:t>
       </w:r>
@@ -1263,6 +1453,11 @@
       </w:r>
     </w:p>
     <w:p>
+      <w:pPr>
+        <w:rPr>
+          <w:rFonts w:hint="eastAsia"/>
+        </w:rPr>
+      </w:pPr>
       <w:r>
         <w:t>alter table fact_process_activity_y2026w25</w:t>
       </w:r>
@@ -1280,6 +1475,11 @@
       </w:r>
     </w:p>
     <w:p>
+      <w:pPr>
+        <w:rPr>
+          <w:rFonts w:hint="eastAsia"/>
+        </w:rPr>
+      </w:pPr>
       <w:r>
         <w:lastRenderedPageBreak/>
         <w:t>create table fact_process_activity_y2026w26</w:t>
@@ -1299,6 +1499,11 @@
       </w:r>
     </w:p>
     <w:p>
+      <w:pPr>
+        <w:rPr>
+          <w:rFonts w:hint="eastAsia"/>
+        </w:rPr>
+      </w:pPr>
       <w:r>
         <w:t>alter table fact_process_activity_y2026w26</w:t>
       </w:r>
@@ -1316,6 +1521,11 @@
       </w:r>
     </w:p>
     <w:p>
+      <w:pPr>
+        <w:rPr>
+          <w:rFonts w:hint="eastAsia"/>
+        </w:rPr>
+      </w:pPr>
       <w:r>
         <w:t>create table fact_process_activity_y2026w27</w:t>
       </w:r>
@@ -1334,6 +1544,11 @@
       </w:r>
     </w:p>
     <w:p>
+      <w:pPr>
+        <w:rPr>
+          <w:rFonts w:hint="eastAsia"/>
+        </w:rPr>
+      </w:pPr>
       <w:r>
         <w:t>alter table fact_process_activity_y2026w27</w:t>
       </w:r>
@@ -1351,6 +1566,11 @@
       </w:r>
     </w:p>
     <w:p>
+      <w:pPr>
+        <w:rPr>
+          <w:rFonts w:hint="eastAsia"/>
+        </w:rPr>
+      </w:pPr>
       <w:r>
         <w:t>create table fact_process_activity_y2026w28</w:t>
       </w:r>
@@ -1369,6 +1589,11 @@
       </w:r>
     </w:p>
     <w:p>
+      <w:pPr>
+        <w:rPr>
+          <w:rFonts w:hint="eastAsia"/>
+        </w:rPr>
+      </w:pPr>
       <w:r>
         <w:t>alter table fact_process_activity_y2026w28</w:t>
       </w:r>
@@ -1386,6 +1611,11 @@
       </w:r>
     </w:p>
     <w:p>
+      <w:pPr>
+        <w:rPr>
+          <w:rFonts w:hint="eastAsia"/>
+        </w:rPr>
+      </w:pPr>
       <w:r>
         <w:t>create table fact_process_activity_y2026w29</w:t>
       </w:r>
@@ -1404,6 +1634,11 @@
       </w:r>
     </w:p>
     <w:p>
+      <w:pPr>
+        <w:rPr>
+          <w:rFonts w:hint="eastAsia"/>
+        </w:rPr>
+      </w:pPr>
       <w:r>
         <w:t>alter table fact_process_activity_y2026w29</w:t>
       </w:r>
@@ -1421,6 +1656,11 @@
       </w:r>
     </w:p>
     <w:p>
+      <w:pPr>
+        <w:rPr>
+          <w:rFonts w:hint="eastAsia"/>
+        </w:rPr>
+      </w:pPr>
       <w:r>
         <w:t>create table fact_process_activity_y2026w30</w:t>
       </w:r>
@@ -1439,6 +1679,11 @@
       </w:r>
     </w:p>
     <w:p>
+      <w:pPr>
+        <w:rPr>
+          <w:rFonts w:hint="eastAsia"/>
+        </w:rPr>
+      </w:pPr>
       <w:r>
         <w:t>alter table fact_process_activity_y2026w30</w:t>
       </w:r>
@@ -1456,6 +1701,11 @@
       </w:r>
     </w:p>
     <w:p>
+      <w:pPr>
+        <w:rPr>
+          <w:rFonts w:hint="eastAsia"/>
+        </w:rPr>
+      </w:pPr>
       <w:r>
         <w:t>create table fact_process_activity_y2026w31</w:t>
       </w:r>
@@ -1474,6 +1724,11 @@
       </w:r>
     </w:p>
     <w:p>
+      <w:pPr>
+        <w:rPr>
+          <w:rFonts w:hint="eastAsia"/>
+        </w:rPr>
+      </w:pPr>
       <w:r>
         <w:t>alter table fact_process_activity_y2026w31</w:t>
       </w:r>
@@ -1491,6 +1746,11 @@
       </w:r>
     </w:p>
     <w:p>
+      <w:pPr>
+        <w:rPr>
+          <w:rFonts w:hint="eastAsia"/>
+        </w:rPr>
+      </w:pPr>
       <w:r>
         <w:t>create table fact_process_activity_y2026w32</w:t>
       </w:r>
@@ -1509,6 +1769,11 @@
       </w:r>
     </w:p>
     <w:p>
+      <w:pPr>
+        <w:rPr>
+          <w:rFonts w:hint="eastAsia"/>
+        </w:rPr>
+      </w:pPr>
       <w:r>
         <w:lastRenderedPageBreak/>
         <w:t>alter table fact_process_activity_y2026w32</w:t>
@@ -1527,6 +1792,11 @@
       </w:r>
     </w:p>
     <w:p>
+      <w:pPr>
+        <w:rPr>
+          <w:rFonts w:hint="eastAsia"/>
+        </w:rPr>
+      </w:pPr>
       <w:r>
         <w:t>-- auto-generated definition</w:t>
       </w:r>
@@ -1686,6 +1956,11 @@
       </w:r>
     </w:p>
     <w:p>
+      <w:pPr>
+        <w:rPr>
+          <w:rFonts w:hint="eastAsia"/>
+        </w:rPr>
+      </w:pPr>
       <w:r>
         <w:t xml:space="preserve">alter table </w:t>
       </w:r>
@@ -1708,6 +1983,11 @@
       </w:r>
     </w:p>
     <w:p>
+      <w:pPr>
+        <w:rPr>
+          <w:rFonts w:hint="eastAsia"/>
+        </w:rPr>
+      </w:pPr>
       <w:r>
         <w:t>create table fact_process_context_y2026w23</w:t>
       </w:r>
@@ -1726,6 +2006,11 @@
       </w:r>
     </w:p>
     <w:p>
+      <w:pPr>
+        <w:rPr>
+          <w:rFonts w:hint="eastAsia"/>
+        </w:rPr>
+      </w:pPr>
       <w:r>
         <w:t>alter table fact_process_context_y2026w23</w:t>
       </w:r>
@@ -1743,6 +2028,11 @@
       </w:r>
     </w:p>
     <w:p>
+      <w:pPr>
+        <w:rPr>
+          <w:rFonts w:hint="eastAsia"/>
+        </w:rPr>
+      </w:pPr>
       <w:r>
         <w:t>create table fact_process_context_y2026w24</w:t>
       </w:r>
@@ -1761,6 +2051,11 @@
       </w:r>
     </w:p>
     <w:p>
+      <w:pPr>
+        <w:rPr>
+          <w:rFonts w:hint="eastAsia"/>
+        </w:rPr>
+      </w:pPr>
       <w:r>
         <w:t>alter table fact_process_context_y2026w24</w:t>
       </w:r>
@@ -1778,6 +2073,11 @@
       </w:r>
     </w:p>
     <w:p>
+      <w:pPr>
+        <w:rPr>
+          <w:rFonts w:hint="eastAsia"/>
+        </w:rPr>
+      </w:pPr>
       <w:r>
         <w:t>create table fact_process_context_y2026w25</w:t>
       </w:r>
@@ -1796,6 +2096,11 @@
       </w:r>
     </w:p>
     <w:p>
+      <w:pPr>
+        <w:rPr>
+          <w:rFonts w:hint="eastAsia"/>
+        </w:rPr>
+      </w:pPr>
       <w:r>
         <w:t>alter table fact_process_context_y2026w25</w:t>
       </w:r>
@@ -1813,6 +2118,11 @@
       </w:r>
     </w:p>
     <w:p>
+      <w:pPr>
+        <w:rPr>
+          <w:rFonts w:hint="eastAsia"/>
+        </w:rPr>
+      </w:pPr>
       <w:r>
         <w:t>create table fact_process_context_y2026w26</w:t>
       </w:r>
@@ -1834,6 +2144,11 @@
       </w:r>
     </w:p>
     <w:p>
+      <w:pPr>
+        <w:rPr>
+          <w:rFonts w:hint="eastAsia"/>
+        </w:rPr>
+      </w:pPr>
       <w:r>
         <w:t>alter table fact_process_context_y2026w26</w:t>
       </w:r>
@@ -1851,6 +2166,11 @@
       </w:r>
     </w:p>
     <w:p>
+      <w:pPr>
+        <w:rPr>
+          <w:rFonts w:hint="eastAsia"/>
+        </w:rPr>
+      </w:pPr>
       <w:r>
         <w:t>create table fact_process_context_y2026w27</w:t>
       </w:r>
@@ -1869,6 +2189,11 @@
       </w:r>
     </w:p>
     <w:p>
+      <w:pPr>
+        <w:rPr>
+          <w:rFonts w:hint="eastAsia"/>
+        </w:rPr>
+      </w:pPr>
       <w:r>
         <w:t>alter table fact_process_context_y2026w27</w:t>
       </w:r>
@@ -1886,6 +2211,11 @@
       </w:r>
     </w:p>
     <w:p>
+      <w:pPr>
+        <w:rPr>
+          <w:rFonts w:hint="eastAsia"/>
+        </w:rPr>
+      </w:pPr>
       <w:r>
         <w:t>create table fact_process_context_y2026w28</w:t>
       </w:r>
@@ -1904,6 +2234,11 @@
       </w:r>
     </w:p>
     <w:p>
+      <w:pPr>
+        <w:rPr>
+          <w:rFonts w:hint="eastAsia"/>
+        </w:rPr>
+      </w:pPr>
       <w:r>
         <w:t>alter table fact_process_context_y2026w28</w:t>
       </w:r>
@@ -1921,6 +2256,11 @@
       </w:r>
     </w:p>
     <w:p>
+      <w:pPr>
+        <w:rPr>
+          <w:rFonts w:hint="eastAsia"/>
+        </w:rPr>
+      </w:pPr>
       <w:r>
         <w:t>create table fact_process_context_y2026w29</w:t>
       </w:r>
@@ -1939,6 +2279,11 @@
       </w:r>
     </w:p>
     <w:p>
+      <w:pPr>
+        <w:rPr>
+          <w:rFonts w:hint="eastAsia"/>
+        </w:rPr>
+      </w:pPr>
       <w:r>
         <w:t>alter table fact_process_context_y2026w29</w:t>
       </w:r>
@@ -1956,6 +2301,11 @@
       </w:r>
     </w:p>
     <w:p>
+      <w:pPr>
+        <w:rPr>
+          <w:rFonts w:hint="eastAsia"/>
+        </w:rPr>
+      </w:pPr>
       <w:r>
         <w:t>create table fact_process_context_y2026w30</w:t>
       </w:r>
@@ -1974,6 +2324,11 @@
       </w:r>
     </w:p>
     <w:p>
+      <w:pPr>
+        <w:rPr>
+          <w:rFonts w:hint="eastAsia"/>
+        </w:rPr>
+      </w:pPr>
       <w:r>
         <w:t>alter table fact_process_context_y2026w30</w:t>
       </w:r>
@@ -1991,6 +2346,11 @@
       </w:r>
     </w:p>
     <w:p>
+      <w:pPr>
+        <w:rPr>
+          <w:rFonts w:hint="eastAsia"/>
+        </w:rPr>
+      </w:pPr>
       <w:r>
         <w:t>create table fact_process_context_y2026w31</w:t>
       </w:r>
@@ -2009,6 +2369,11 @@
       </w:r>
     </w:p>
     <w:p>
+      <w:pPr>
+        <w:rPr>
+          <w:rFonts w:hint="eastAsia"/>
+        </w:rPr>
+      </w:pPr>
       <w:r>
         <w:t>alter table fact_process_context_y2026w31</w:t>
       </w:r>
@@ -2026,6 +2391,11 @@
       </w:r>
     </w:p>
     <w:p>
+      <w:pPr>
+        <w:rPr>
+          <w:rFonts w:hint="eastAsia"/>
+        </w:rPr>
+      </w:pPr>
       <w:r>
         <w:t>create table fact_process_context_y2026w32</w:t>
       </w:r>
@@ -2044,6 +2414,11 @@
       </w:r>
     </w:p>
     <w:p>
+      <w:pPr>
+        <w:rPr>
+          <w:rFonts w:hint="eastAsia"/>
+        </w:rPr>
+      </w:pPr>
       <w:r>
         <w:lastRenderedPageBreak/>
         <w:t>alter table fact_process_context_y2026w32</w:t>
@@ -2062,6 +2437,11 @@
       </w:r>
     </w:p>
     <w:p>
+      <w:pPr>
+        <w:rPr>
+          <w:rFonts w:hint="eastAsia"/>
+        </w:rPr>
+      </w:pPr>
       <w:r>
         <w:t>-- auto-generated definition</w:t>
       </w:r>
@@ -2186,6 +2566,11 @@
       </w:r>
     </w:p>
     <w:p>
+      <w:pPr>
+        <w:rPr>
+          <w:rFonts w:hint="eastAsia"/>
+        </w:rPr>
+      </w:pPr>
       <w:r>
         <w:t xml:space="preserve">alter table </w:t>
       </w:r>
@@ -2208,6 +2593,11 @@
       </w:r>
     </w:p>
     <w:p>
+      <w:pPr>
+        <w:rPr>
+          <w:rFonts w:hint="eastAsia"/>
+        </w:rPr>
+      </w:pPr>
       <w:r>
         <w:t xml:space="preserve">create index </w:t>
       </w:r>
@@ -2254,6 +2644,11 @@
       </w:r>
     </w:p>
     <w:p>
+      <w:pPr>
+        <w:rPr>
+          <w:rFonts w:hint="eastAsia"/>
+        </w:rPr>
+      </w:pPr>
       <w:r>
         <w:t>-- auto-generated definition</w:t>
       </w:r>
@@ -2629,6 +3024,11 @@
       </w:r>
     </w:p>
     <w:p>
+      <w:pPr>
+        <w:rPr>
+          <w:rFonts w:hint="eastAsia"/>
+        </w:rPr>
+      </w:pPr>
       <w:r>
         <w:t xml:space="preserve">alter table </w:t>
       </w:r>
@@ -2651,6 +3051,11 @@
       </w:r>
     </w:p>
     <w:p>
+      <w:pPr>
+        <w:rPr>
+          <w:rFonts w:hint="eastAsia"/>
+        </w:rPr>
+      </w:pPr>
       <w:r>
         <w:t>create table fact_system_hardware_y2026m06</w:t>
       </w:r>
@@ -2669,6 +3074,11 @@
       </w:r>
     </w:p>
     <w:p>
+      <w:pPr>
+        <w:rPr>
+          <w:rFonts w:hint="eastAsia"/>
+        </w:rPr>
+      </w:pPr>
       <w:r>
         <w:t>alter table fact_system_hardware_y2026m06</w:t>
       </w:r>
@@ -2686,6 +3096,11 @@
       </w:r>
     </w:p>
     <w:p>
+      <w:pPr>
+        <w:rPr>
+          <w:rFonts w:hint="eastAsia"/>
+        </w:rPr>
+      </w:pPr>
       <w:r>
         <w:t>create table fact_system_hardware_y2026m07</w:t>
       </w:r>
@@ -2704,6 +3119,11 @@
       </w:r>
     </w:p>
     <w:p>
+      <w:pPr>
+        <w:rPr>
+          <w:rFonts w:hint="eastAsia"/>
+        </w:rPr>
+      </w:pPr>
       <w:r>
         <w:t>alter table fact_system_hardware_y2026m07</w:t>
       </w:r>
@@ -2721,6 +3141,11 @@
       </w:r>
     </w:p>
     <w:p>
+      <w:pPr>
+        <w:rPr>
+          <w:rFonts w:hint="eastAsia"/>
+        </w:rPr>
+      </w:pPr>
       <w:r>
         <w:t>create table fact_system_hardware_y2026m08</w:t>
       </w:r>
@@ -2739,6 +3164,11 @@
       </w:r>
     </w:p>
     <w:p>
+      <w:pPr>
+        <w:rPr>
+          <w:rFonts w:hint="eastAsia"/>
+        </w:rPr>
+      </w:pPr>
       <w:r>
         <w:t>alter table fact_system_hardware_y2026m08</w:t>
       </w:r>
@@ -2756,15 +3186,49 @@
       </w:r>
     </w:p>
     <w:p>
-      <w:pPr>
-        <w:rPr>
-          <w:rFonts w:hint="eastAsia"/>
-        </w:rPr>
-      </w:pPr>
       <w:r>
         <w:lastRenderedPageBreak/>
         <w:t>Get-Content -Wait -Tail 10 E:\TimeAudit\telemetry.log -Encoding utf8</w:t>
       </w:r>
+    </w:p>
+    <w:p>
+      <w:pPr>
+        <w:rPr>
+          <w:rFonts w:hint="eastAsia"/>
+        </w:rPr>
+      </w:pPr>
+      <w:r>
+        <w:t xml:space="preserve">Get-Process -Name python, </w:t>
+      </w:r>
+      <w:proofErr w:type="spellStart"/>
+      <w:r>
+        <w:t>PresentMonConsole</w:t>
+      </w:r>
+      <w:proofErr w:type="spellEnd"/>
+      <w:r>
+        <w:t xml:space="preserve">, </w:t>
+      </w:r>
+      <w:proofErr w:type="spellStart"/>
+      <w:r>
+        <w:t>PresentMon</w:t>
+      </w:r>
+      <w:proofErr w:type="spellEnd"/>
+      <w:r>
+        <w:t xml:space="preserve"> -</w:t>
+      </w:r>
+      <w:proofErr w:type="spellStart"/>
+      <w:r>
+        <w:t>ErrorAction</w:t>
+      </w:r>
+      <w:proofErr w:type="spellEnd"/>
+      <w:r>
+        <w:t xml:space="preserve"> </w:t>
+      </w:r>
+      <w:proofErr w:type="spellStart"/>
+      <w:r>
+        <w:t>SilentlyContinue</w:t>
+      </w:r>
+      <w:proofErr w:type="spellEnd"/>
     </w:p>
     <w:sectPr>
       <w:pgSz w:w="11906" w:h="16838"/>
@@ -4610,6 +5074,7 @@
   <w:style w:type="character" w:default="1" w:styleId="a0">
     <w:name w:val="Default Paragraph Font"/>
     <w:uiPriority w:val="1"/>
+    <w:semiHidden/>
     <w:unhideWhenUsed/>
   </w:style>
   <w:style w:type="table" w:default="1" w:styleId="a1">

</xml_diff>